<commit_message>
docs: 报告补充 GitHub 托管与 Issues 结果
</commit_message>
<xml_diff>
--- a/docs/软件体系结构_实验01_软件配置管理_实验报告.docx
+++ b/docs/软件体系结构_实验01_软件配置管理_实验报告.docx
@@ -5267,7 +5267,7 @@
               <w:rPr>
                 <w:rFonts w:hint="eastAsia"/>
               </w:rPr>
-              <w:t xml:space="preserve">仓库已推送到 https://github.com/Savior-R/Soft_Learning（main 分支 6 次提交 + v1.0.0 标签），本地裸仓库保留作为对照</w:t>
+              <w:t xml:space="preserve">仓库已推送到 https://github.com/Savior-R/Soft_Learning（main 分支 + v1.0.0 标签 + 2 条已关闭 Issues），本地裸仓库保留作为对照</w:t>
             </w:r>
           </w:p>
         </w:tc>
@@ -5393,7 +5393,7 @@
               <w:rPr>
                 <w:rFonts w:hint="eastAsia"/>
               </w:rPr>
-              <w:t>6 次提交（成员A 5 次、成员B 1 次）、2 次推送、1 次快进拉取、1 次三方合并、1 次冲突解决</w:t>
+              <w:t xml:space="preserve">协作阶段 6 次提交（成员A 5 次、成员B 1 次）、1 次快进拉取、1 次三方合并并解决冲突、1 次误提交 revert、1 个 v1.0.0 标签；托管到 GitHub 后追加归档与文档提交，并创建 2 条 Issues 关联提交后关闭</w:t>
             </w:r>
           </w:p>
         </w:tc>
@@ -6595,7 +6595,7 @@
         <w:rPr>
           <w:rFonts w:hint="eastAsia"/>
         </w:rPr>
-        <w:t>本次实验完整走通了集中式与分布式两条配置管理主线。SVN 侧建立了配置库、划分了用户与权限、完成了检出/提交/更新/冲突解决的全流程，4 个版本号的演进清晰可查；Git 侧完成了本地仓库与远程仓库的对接、成员身份隔离、特性分支与三方合并、冲突解决、误提交回退与版本标签，6 次提交构成一张有分叉有汇合的历史图。</w:t>
+        <w:t xml:space="preserve">本次实验完整走通了集中式与分布式两条配置管理主线。SVN 侧建立了配置库、划分了用户与权限、完成了检出/提交/更新/冲突解决的全流程，4 个版本号的演进清晰可查；Git 侧完成了本地仓库与远程仓库的对接、成员身份隔离、特性分支与三方合并、冲突解决、误提交回退与版本标签，6 次协作提交构成一张有分叉有汇合的历史图，最终连同实验报告一起托管到 GitHub 仓库。</w:t>
       </w:r>
     </w:p>
     <w:p>

</xml_diff>